<commit_message>
removed portfolio from gitignore!
</commit_message>
<xml_diff>
--- a/docs/group-activities/week-8/pa-7-task-card.docx
+++ b/docs/group-activities/week-8/pa-7-task-card.docx
@@ -80,213 +80,88 @@
           <w:i/>
           <w:iCs/>
         </w:rPr>
-        <w:t xml:space="preserve">This task is complex. It requires many different types of abilities. Everyone</w:t>
+        <w:t xml:space="preserve">This task is complex. It requires many different types of abilities. Everyone will be good at some of these abilities but nobody will be good at all of them. In order to solve this puzzle, you will need to use the skills of each member of your group.</w:t>
+      </w:r>
+    </w:p>
+    <w:bookmarkStart w:id="27" w:name="groupwork-protocols"/>
+    <w:p>
+      <w:pPr>
+        <w:pStyle w:val="Heading1"/>
+      </w:pPr>
+      <w:r>
+        <w:t xml:space="preserve">Groupwork Protocols</w:t>
+      </w:r>
+    </w:p>
+    <w:p>
+      <w:pPr>
+        <w:pStyle w:val="FirstParagraph"/>
+      </w:pPr>
+      <w:r>
+        <w:t xml:space="preserve">During the Practice Activity, you and your partner will alternate between two roles—Computer and Coder.</w:t>
+      </w:r>
+    </w:p>
+    <w:p>
+      <w:pPr>
+        <w:pStyle w:val="BodyText"/>
+      </w:pPr>
+      <w:r>
+        <w:t xml:space="preserve">When you are the</w:t>
+      </w:r>
+      <w:r>
+        <w:t xml:space="preserve"> </w:t>
       </w:r>
       <w:r>
         <w:rPr>
           <w:b/>
           <w:bCs/>
-          <w:i/>
-          <w:iCs/>
-        </w:rPr>
+        </w:rPr>
+        <w:t xml:space="preserve">Computer</w:t>
+      </w:r>
+      <w:r>
+        <w:t xml:space="preserve">, you will type into the Quarto document in RStudio. However, you</w:t>
+      </w:r>
+      <w:r>
         <w:t xml:space="preserve"> </w:t>
       </w:r>
       <w:r>
         <w:rPr>
           <w:b/>
           <w:bCs/>
-          <w:i/>
-          <w:iCs/>
-        </w:rPr>
-        <w:t xml:space="preserve">will be good at some of these abilities but nobody will be good at all of them.</w:t>
+        </w:rPr>
+        <w:t xml:space="preserve">do not</w:t>
+      </w:r>
+      <w:r>
+        <w:t xml:space="preserve"> </w:t>
+      </w:r>
+      <w:r>
+        <w:t xml:space="preserve">type your own ideas. Instead, you type what the Coder tells you to type. You are permitted to ask the Coder clarifying questions, and, if both of you have a question, you are permitted to ask the professor. You are expected to run the code provided by the Coder and, if necessary, to work with the Coder to debug the code. Once the code runs, you are expected to collaborate with the Coder to write code comments that describe the actions taken by your code.</w:t>
+      </w:r>
+    </w:p>
+    <w:p>
+      <w:pPr>
+        <w:pStyle w:val="BodyText"/>
+      </w:pPr>
+      <w:r>
+        <w:t xml:space="preserve">When you are the</w:t>
+      </w:r>
+      <w:r>
+        <w:t xml:space="preserve"> </w:t>
       </w:r>
       <w:r>
         <w:rPr>
           <w:b/>
           <w:bCs/>
-          <w:i/>
-          <w:iCs/>
-        </w:rPr>
-        <w:t xml:space="preserve"> </w:t>
-      </w:r>
-      <w:r>
-        <w:rPr>
-          <w:b/>
-          <w:bCs/>
-          <w:i/>
-          <w:iCs/>
-        </w:rPr>
-        <w:t xml:space="preserve">In order to solve this puzzle, you will need to use the skills of each member of</w:t>
-      </w:r>
-      <w:r>
-        <w:rPr>
-          <w:b/>
-          <w:bCs/>
-          <w:i/>
-          <w:iCs/>
-        </w:rPr>
-        <w:t xml:space="preserve"> </w:t>
-      </w:r>
-      <w:r>
-        <w:rPr>
-          <w:b/>
-          <w:bCs/>
-          <w:i/>
-          <w:iCs/>
-        </w:rPr>
-        <w:t xml:space="preserve">your group.</w:t>
-      </w:r>
-    </w:p>
-    <w:bookmarkStart w:id="20" w:name="group-roles"/>
-    <w:p>
-      <w:pPr>
-        <w:pStyle w:val="Heading2"/>
-      </w:pPr>
-      <w:r>
-        <w:t xml:space="preserve">Group Roles</w:t>
-      </w:r>
-    </w:p>
-    <w:p>
-      <w:pPr>
-        <w:pStyle w:val="FirstParagraph"/>
-      </w:pPr>
-      <w:r>
-        <w:t xml:space="preserve">When you are the</w:t>
-      </w:r>
-      <w:r>
-        <w:t xml:space="preserve"> </w:t>
-      </w:r>
-      <w:r>
-        <w:rPr>
-          <w:b/>
-          <w:bCs/>
-        </w:rPr>
-        <w:t xml:space="preserve">Developer</w:t>
-      </w:r>
-      <w:r>
-        <w:t xml:space="preserve">, you will type into the Quarto document in</w:t>
-      </w:r>
-      <w:r>
-        <w:t xml:space="preserve"> </w:t>
-      </w:r>
-      <w:r>
-        <w:t xml:space="preserve">RStudio. However, you</w:t>
-      </w:r>
-      <w:r>
-        <w:t xml:space="preserve"> </w:t>
-      </w:r>
-      <w:r>
-        <w:rPr>
-          <w:b/>
-          <w:bCs/>
-        </w:rPr>
-        <w:t xml:space="preserve">do not</w:t>
-      </w:r>
-      <w:r>
-        <w:t xml:space="preserve"> </w:t>
-      </w:r>
-      <w:r>
-        <w:t xml:space="preserve">type your own ideas. Instead, you type what</w:t>
-      </w:r>
-      <w:r>
-        <w:t xml:space="preserve"> </w:t>
-      </w:r>
-      <w:r>
-        <w:t xml:space="preserve">the Coder tells you to type. You are permitted to ask the Coder clarifying</w:t>
-      </w:r>
-      <w:r>
-        <w:t xml:space="preserve"> </w:t>
-      </w:r>
-      <w:r>
-        <w:t xml:space="preserve">questions, and, if both of you have a question, you are permitted to ask the</w:t>
-      </w:r>
-      <w:r>
-        <w:t xml:space="preserve"> </w:t>
-      </w:r>
-      <w:r>
-        <w:t xml:space="preserve">professor. You are expected to run the code provided by the Coder and, if</w:t>
-      </w:r>
-      <w:r>
-        <w:t xml:space="preserve"> </w:t>
-      </w:r>
-      <w:r>
-        <w:t xml:space="preserve">necessary, to work with the Coder to debug the code. Once the code runs, you</w:t>
-      </w:r>
-      <w:r>
-        <w:t xml:space="preserve"> </w:t>
-      </w:r>
-      <w:r>
-        <w:t xml:space="preserve">are expected to collaborate with the Coder to write code comments that describe</w:t>
-      </w:r>
-      <w:r>
-        <w:t xml:space="preserve"> </w:t>
-      </w:r>
-      <w:r>
-        <w:t xml:space="preserve">the actions taken by your code.</w:t>
-      </w:r>
-    </w:p>
-    <w:p>
-      <w:pPr>
-        <w:pStyle w:val="BodyText"/>
-      </w:pPr>
-      <w:r>
-        <w:t xml:space="preserve">When you are the</w:t>
-      </w:r>
-      <w:r>
-        <w:t xml:space="preserve"> </w:t>
-      </w:r>
-      <w:r>
-        <w:rPr>
-          <w:b/>
-          <w:bCs/>
         </w:rPr>
         <w:t xml:space="preserve">Coder</w:t>
       </w:r>
       <w:r>
-        <w:t xml:space="preserve">, you are responsible for reading the</w:t>
-      </w:r>
-      <w:r>
-        <w:t xml:space="preserve"> </w:t>
-      </w:r>
-      <w:r>
-        <w:t xml:space="preserve">instructions / prompts and directing the Developer what to type in the Quarto</w:t>
-      </w:r>
-      <w:r>
-        <w:t xml:space="preserve"> </w:t>
-      </w:r>
-      <w:r>
-        <w:t xml:space="preserve">document. You are responsible for managing the resources your group has</w:t>
-      </w:r>
-      <w:r>
-        <w:t xml:space="preserve"> </w:t>
-      </w:r>
-      <w:r>
-        <w:t xml:space="preserve">available to you (e.g., cheatsheet, textbook). If necessary, you should work</w:t>
-      </w:r>
-      <w:r>
-        <w:t xml:space="preserve"> </w:t>
-      </w:r>
-      <w:r>
-        <w:t xml:space="preserve">with the Developer to debug the code you specified. Once the code runs, you</w:t>
-      </w:r>
-      <w:r>
-        <w:t xml:space="preserve"> </w:t>
-      </w:r>
-      <w:r>
-        <w:t xml:space="preserve">are expected to collaborate with the Developer to write code comments that</w:t>
-      </w:r>
-      <w:r>
-        <w:t xml:space="preserve"> </w:t>
-      </w:r>
-      <w:r>
-        <w:t xml:space="preserve">describe the actions taken by your code.</w:t>
-      </w:r>
-    </w:p>
-    <w:bookmarkEnd w:id="20"/>
-    <w:bookmarkStart w:id="21" w:name="group-norms"/>
-    <w:p>
-      <w:pPr>
-        <w:pStyle w:val="Heading2"/>
+        <w:t xml:space="preserve">, you are responsible for reading the instructions / prompts and directing the Computer what to type in the Quarto document. You are responsible for managing the resources your group has available to you (e.g., cheatsheet, textbook). If necessary, you should work with the Computer to debug the code you specified. Once the code runs, you are expected to collaborate with the Computer to write code comments that describe the actions taken by your code.</w:t>
+      </w:r>
+    </w:p>
+    <w:bookmarkStart w:id="20" w:name="group-norms"/>
+    <w:p>
+      <w:pPr>
+        <w:pStyle w:val="Heading3"/>
       </w:pPr>
       <w:r>
         <w:t xml:space="preserve">Group Norms</w:t>
@@ -309,7 +184,7 @@
         </w:numPr>
       </w:pPr>
       <w:r>
-        <w:t xml:space="preserve">Think and work together. Do not divide the work.</w:t>
+        <w:t xml:space="preserve">Be curious. Don’t correct.</w:t>
       </w:r>
     </w:p>
     <w:p>
@@ -321,7 +196,7 @@
         </w:numPr>
       </w:pPr>
       <w:r>
-        <w:t xml:space="preserve">You are smarter together.</w:t>
+        <w:t xml:space="preserve">Be open minded.</w:t>
       </w:r>
     </w:p>
     <w:p>
@@ -333,7 +208,7 @@
         </w:numPr>
       </w:pPr>
       <w:r>
-        <w:t xml:space="preserve">Be open minded.</w:t>
+        <w:t xml:space="preserve">Ask questions rather than contribute.</w:t>
       </w:r>
     </w:p>
     <w:p>
@@ -345,7 +220,7 @@
         </w:numPr>
       </w:pPr>
       <w:r>
-        <w:t xml:space="preserve">No cross-talk with other groups.</w:t>
+        <w:t xml:space="preserve">Respect each other.</w:t>
       </w:r>
     </w:p>
     <w:p>
@@ -357,6 +232,42 @@
         </w:numPr>
       </w:pPr>
       <w:r>
+        <w:t xml:space="preserve">Allow each teammate to contribute to the activity through their role.</w:t>
+      </w:r>
+    </w:p>
+    <w:p>
+      <w:pPr>
+        <w:pStyle w:val="Compact"/>
+        <w:numPr>
+          <w:ilvl w:val="0"/>
+          <w:numId w:val="1001"/>
+        </w:numPr>
+      </w:pPr>
+      <w:r>
+        <w:t xml:space="preserve">Do not divide the work.</w:t>
+      </w:r>
+    </w:p>
+    <w:p>
+      <w:pPr>
+        <w:pStyle w:val="Compact"/>
+        <w:numPr>
+          <w:ilvl w:val="0"/>
+          <w:numId w:val="1001"/>
+        </w:numPr>
+      </w:pPr>
+      <w:r>
+        <w:t xml:space="preserve">No cross talk with other groups.</w:t>
+      </w:r>
+    </w:p>
+    <w:p>
+      <w:pPr>
+        <w:pStyle w:val="Compact"/>
+        <w:numPr>
+          <w:ilvl w:val="0"/>
+          <w:numId w:val="1001"/>
+        </w:numPr>
+      </w:pPr>
+      <w:r>
         <w:t xml:space="preserve">Communicate with each other!</w:t>
       </w:r>
     </w:p>
@@ -365,8 +276,8 @@
         <w:br w:type="page"/>
       </w:r>
     </w:p>
-    <w:bookmarkEnd w:id="21"/>
-    <w:bookmarkStart w:id="25" w:name="lengthening-data"/>
+    <w:bookmarkEnd w:id="20"/>
+    <w:bookmarkStart w:id="24" w:name="lengthening-data"/>
     <w:p>
       <w:pPr>
         <w:pStyle w:val="Heading2"/>
@@ -530,18 +441,18 @@
           <wp:inline>
             <wp:extent cx="5334000" cy="2565353"/>
             <wp:effectExtent b="0" l="0" r="0" t="0"/>
-            <wp:docPr descr="" title="" id="23" name="Picture"/>
+            <wp:docPr descr="" title="" id="22" name="Picture"/>
             <a:graphic>
               <a:graphicData uri="http://schemas.openxmlformats.org/drawingml/2006/picture">
                 <pic:pic>
                   <pic:nvPicPr>
-                    <pic:cNvPr descr="images/pivot-longer.png" id="24" name="Picture"/>
+                    <pic:cNvPr descr="images/pivot-longer.png" id="23" name="Picture"/>
                     <pic:cNvPicPr>
                       <a:picLocks noChangeArrowheads="1" noChangeAspect="1"/>
                     </pic:cNvPicPr>
                   </pic:nvPicPr>
                   <pic:blipFill>
-                    <a:blip r:embed="rId22"/>
+                    <a:blip r:embed="rId21"/>
                     <a:stretch>
                       <a:fillRect/>
                     </a:stretch>
@@ -568,8 +479,8 @@
         </w:drawing>
       </w:r>
     </w:p>
-    <w:bookmarkEnd w:id="25"/>
-    <w:bookmarkStart w:id="27" w:name="code-formatting"/>
+    <w:bookmarkEnd w:id="24"/>
+    <w:bookmarkStart w:id="26" w:name="code-formatting"/>
     <w:p>
       <w:pPr>
         <w:pStyle w:val="Heading2"/>
@@ -632,7 +543,7 @@
       <w:r>
         <w:t xml:space="preserve"> </w:t>
       </w:r>
-      <w:hyperlink r:id="rId26">
+      <w:hyperlink r:id="rId25">
         <w:r>
           <w:rPr>
             <w:rStyle w:val="Hyperlink"/>
@@ -791,6 +702,7 @@
         <w:t xml:space="preserve">when needed (if code is more than 80 characters in length)</w:t>
       </w:r>
     </w:p>
+    <w:bookmarkEnd w:id="26"/>
     <w:bookmarkEnd w:id="27"/>
     <w:sectPr>
       <w:footnotePr>

</xml_diff>